<commit_message>
feat(lab02): update to variant 38 (k=19, n=5.1) with full artifacts
</commit_message>
<xml_diff>
--- a/labs/lab02/report/mathmod-lab02-report.docx
+++ b/labs/lab02/report/mathmod-lab02-report.docx
@@ -15,7 +15,7 @@
         <w:pStyle w:val="Subtitle"/>
       </w:pPr>
       <w:r>
-        <w:t xml:space="preserve">Траектория погони в полярных координатах</w:t>
+        <w:t xml:space="preserve">Вариант 38: k = 19 км, n = 5.1</w:t>
       </w:r>
     </w:p>
     <w:p>
@@ -45,27 +45,31 @@
         <w:t xml:space="preserve"> </w:t>
       </w:r>
       <w:r>
-        <w:t xml:space="preserve">Выводится система дифференциальных уравнений, описывающая траекторию</w:t>
-      </w:r>
-      <w:r>
-        <w:t xml:space="preserve"> </w:t>
-      </w:r>
-      <w:r>
-        <w:t xml:space="preserve">катера в полярных координатах. Проводится численное решение в Julia</w:t>
-      </w:r>
-      <w:r>
-        <w:t xml:space="preserve"> </w:t>
-      </w:r>
-      <w:r>
-        <w:t xml:space="preserve">для двух случаев начальных условий.</w:t>
-      </w:r>
-    </w:p>
-    <w:p>
-      <w:pPr>
-        <w:pStyle w:val="Abstract"/>
-      </w:pPr>
-      <w:r>
-        <w:t xml:space="preserve">Строятся траектории катера и лодки, определяется точка пересечения.</w:t>
+        <w:t xml:space="preserve">Лодка обнаружена на расстоянии k = 19 км, скорость катера в n = 5.1</w:t>
+      </w:r>
+      <w:r>
+        <w:t xml:space="preserve"> </w:t>
+      </w:r>
+      <w:r>
+        <w:t xml:space="preserve">раза больше скорости лодки. Выводится система дифференциальных</w:t>
+      </w:r>
+      <w:r>
+        <w:t xml:space="preserve"> </w:t>
+      </w:r>
+      <w:r>
+        <w:t xml:space="preserve">уравнений, описывающая траекторию катера в полярных координатах.</w:t>
+      </w:r>
+      <w:r>
+        <w:t xml:space="preserve"> </w:t>
+      </w:r>
+      <w:r>
+        <w:t xml:space="preserve">Проводится численное решение в Julia для двух случаев начальных</w:t>
+      </w:r>
+      <w:r>
+        <w:t xml:space="preserve"> </w:t>
+      </w:r>
+      <w:r>
+        <w:t xml:space="preserve">условий, строятся траектории и находится точка пересечения.</w:t>
       </w:r>
     </w:p>
     <w:sdt>
@@ -156,12 +160,50 @@
         <m:r>
           <m:t>n</m:t>
         </m:r>
+        <m:r>
+          <m:rPr>
+            <m:sty m:val="p"/>
+          </m:rPr>
+          <m:t>=</m:t>
+        </m:r>
+        <m:r>
+          <m:t>5.1</m:t>
+        </m:r>
       </m:oMath>
       <w:r>
         <w:t xml:space="preserve"> </w:t>
       </w:r>
       <w:r>
-        <w:t xml:space="preserve">раз больше скорости лодки.</w:t>
+        <w:t xml:space="preserve">раз больше скорости</w:t>
+      </w:r>
+      <w:r>
+        <w:t xml:space="preserve"> </w:t>
+      </w:r>
+      <w:r>
+        <w:t xml:space="preserve">лодки, а начальное расстояние</w:t>
+      </w:r>
+      <w:r>
+        <w:t xml:space="preserve"> </w:t>
+      </w:r>
+      <m:oMath>
+        <m:r>
+          <m:t>k</m:t>
+        </m:r>
+        <m:r>
+          <m:rPr>
+            <m:sty m:val="p"/>
+          </m:rPr>
+          <m:t>=</m:t>
+        </m:r>
+        <m:r>
+          <m:t>19</m:t>
+        </m:r>
+      </m:oMath>
+      <w:r>
+        <w:t xml:space="preserve"> </w:t>
+      </w:r>
+      <w:r>
+        <w:t xml:space="preserve">км.</w:t>
       </w:r>
     </w:p>
     <w:bookmarkEnd w:id="21"/>
@@ -323,7 +365,7 @@
           <m:t>=</m:t>
         </m:r>
         <m:r>
-          <m:t>6</m:t>
+          <m:t>19</m:t>
         </m:r>
       </m:oMath>
       <w:r>
@@ -349,20 +391,20 @@
           <m:t>=</m:t>
         </m:r>
         <m:r>
-          <m:t>2</m:t>
+          <m:t>5.1</m:t>
         </m:r>
       </m:oMath>
       <w:r>
         <w:t xml:space="preserve"> </w:t>
       </w:r>
       <w:r>
-        <w:t xml:space="preserve">раза больше скорости лодки. Требуется построить</w:t>
-      </w:r>
-      <w:r>
-        <w:t xml:space="preserve"> </w:t>
-      </w:r>
-      <w:r>
-        <w:t xml:space="preserve">траекторию катера, при которой он догоняет лодку.</w:t>
+        <w:t xml:space="preserve">раза больше скорости лодки. Требуется</w:t>
+      </w:r>
+      <w:r>
+        <w:t xml:space="preserve"> </w:t>
+      </w:r>
+      <w:r>
+        <w:t xml:space="preserve">построить траекторию катера, при которой он догоняет лодку.</w:t>
       </w:r>
     </w:p>
     <w:bookmarkEnd w:id="25"/>
@@ -786,7 +828,7 @@
     </w:p>
     <w:bookmarkEnd w:id="26"/>
     <w:bookmarkEnd w:id="27"/>
-    <w:bookmarkStart w:id="28" w:name="материалы-и-методы"/>
+    <w:bookmarkStart w:id="30" w:name="материалы-и-методы"/>
     <w:p>
       <w:pPr>
         <w:pStyle w:val="Heading1"/>
@@ -800,7 +842,7 @@
         <w:pStyle w:val="FirstParagraph"/>
       </w:pPr>
       <w:r>
-        <w:t xml:space="preserve">Работа выполнена на языке Julia с пакетами:</w:t>
+        <w:t xml:space="preserve">Работа выполнена на языке Julia 1.13 с пакетами:</w:t>
       </w:r>
     </w:p>
     <w:p>
@@ -887,23 +929,13 @@
         <w:t xml:space="preserve">— литературное программирование</w:t>
       </w:r>
     </w:p>
-    <w:bookmarkEnd w:id="28"/>
-    <w:bookmarkStart w:id="33" w:name="выполнение-лабораторной-работы"/>
-    <w:p>
-      <w:pPr>
-        <w:pStyle w:val="Heading1"/>
-      </w:pPr>
-      <w:r>
-        <w:t xml:space="preserve">4. Выполнение лабораторной работы</w:t>
-      </w:r>
-    </w:p>
-    <w:bookmarkStart w:id="29" w:name="параметры-задачи"/>
+    <w:bookmarkStart w:id="28" w:name="параметры-задачи"/>
     <w:p>
       <w:pPr>
         <w:pStyle w:val="Heading2"/>
       </w:pPr>
       <w:r>
-        <w:t xml:space="preserve">4.1 Параметры задачи</w:t>
+        <w:t xml:space="preserve">3.1 Параметры задачи</w:t>
       </w:r>
     </w:p>
     <w:p>
@@ -925,7 +957,7 @@
           <m:t>=</m:t>
         </m:r>
         <m:r>
-          <m:t>6</m:t>
+          <m:t>19</m:t>
         </m:r>
       </m:oMath>
       <w:r>
@@ -954,24 +986,36 @@
           <m:t>=</m:t>
         </m:r>
         <m:r>
-          <m:t>2</m:t>
+          <m:t>5.1</m:t>
         </m:r>
       </m:oMath>
       <w:r>
         <w:t xml:space="preserve"> </w:t>
       </w:r>
       <w:r>
-        <w:t xml:space="preserve">— скорость катера в 2 раза больше скорости лодки</w:t>
-      </w:r>
-    </w:p>
-    <w:bookmarkEnd w:id="29"/>
-    <w:bookmarkStart w:id="30" w:name="случай-1-theta_0-0-r_0-k3"/>
+        <w:t xml:space="preserve">— скорость катера в 5.1 раз больше скорости лодки</w:t>
+      </w:r>
+    </w:p>
+    <w:bookmarkEnd w:id="28"/>
+    <w:bookmarkStart w:id="29" w:name="два-случая-начальных-условий"/>
     <w:p>
       <w:pPr>
         <w:pStyle w:val="Heading2"/>
       </w:pPr>
       <w:r>
-        <w:t xml:space="preserve">4.2 Случай 1:</w:t>
+        <w:t xml:space="preserve">3.2 Два случая начальных условий</w:t>
+      </w:r>
+    </w:p>
+    <w:p>
+      <w:pPr>
+        <w:pStyle w:val="FirstParagraph"/>
+      </w:pPr>
+      <w:r>
+        <w:rPr>
+          <w:b/>
+          <w:bCs/>
+        </w:rPr>
+        <w:t xml:space="preserve">Случай 1:</w:t>
       </w:r>
       <w:r>
         <w:t xml:space="preserve"> </w:t>
@@ -1036,37 +1080,6 @@
         <m:r>
           <m:t>3</m:t>
         </m:r>
-      </m:oMath>
-    </w:p>
-    <w:p>
-      <w:pPr>
-        <w:pStyle w:val="FirstParagraph"/>
-      </w:pPr>
-      <w:r>
-        <w:t xml:space="preserve">Катер сначала идёт прямолинейно навстречу лодке, пока не окажется</w:t>
-      </w:r>
-      <w:r>
-        <w:t xml:space="preserve"> </w:t>
-      </w:r>
-      <w:r>
-        <w:t xml:space="preserve">на том же расстоянии от полюса, что и лодка. Это расстояние —</w:t>
-      </w:r>
-      <w:r>
-        <w:t xml:space="preserve"> </w:t>
-      </w:r>
-      <m:oMath>
-        <m:sSub>
-          <m:e>
-            <m:r>
-              <m:t>x</m:t>
-            </m:r>
-          </m:e>
-          <m:sub>
-            <m:r>
-              <m:t>1</m:t>
-            </m:r>
-          </m:sub>
-        </m:sSub>
         <m:r>
           <m:rPr>
             <m:sty m:val="p"/>
@@ -1074,39 +1087,26 @@
           <m:t>=</m:t>
         </m:r>
         <m:r>
-          <m:t>k</m:t>
-        </m:r>
-        <m:r>
-          <m:rPr>
-            <m:sty m:val="p"/>
-          </m:rPr>
-          <m:t>/</m:t>
-        </m:r>
-        <m:r>
-          <m:t>3</m:t>
-        </m:r>
-        <m:r>
-          <m:rPr>
-            <m:sty m:val="p"/>
-          </m:rPr>
-          <m:t>=</m:t>
-        </m:r>
-        <m:r>
-          <m:t>2</m:t>
+          <m:t>6.33</m:t>
         </m:r>
       </m:oMath>
       <w:r>
-        <w:t xml:space="preserve">.</w:t>
-      </w:r>
-    </w:p>
-    <w:bookmarkEnd w:id="30"/>
-    <w:bookmarkStart w:id="31" w:name="случай-2-theta_0--pi-r_0-k"/>
-    <w:p>
-      <w:pPr>
-        <w:pStyle w:val="Heading2"/>
-      </w:pPr>
-      <w:r>
-        <w:t xml:space="preserve">4.3 Случай 2:</w:t>
+        <w:t xml:space="preserve"> </w:t>
+      </w:r>
+      <w:r>
+        <w:t xml:space="preserve">— катер идёт навстречу лодке.</w:t>
+      </w:r>
+    </w:p>
+    <w:p>
+      <w:pPr>
+        <w:pStyle w:val="BodyText"/>
+      </w:pPr>
+      <w:r>
+        <w:rPr>
+          <w:b/>
+          <w:bCs/>
+        </w:rPr>
+        <w:t xml:space="preserve">Случай 2:</w:t>
       </w:r>
       <w:r>
         <w:t xml:space="preserve"> </w:t>
@@ -1168,37 +1168,6 @@
         <m:r>
           <m:t>k</m:t>
         </m:r>
-      </m:oMath>
-    </w:p>
-    <w:p>
-      <w:pPr>
-        <w:pStyle w:val="FirstParagraph"/>
-      </w:pPr>
-      <w:r>
-        <w:t xml:space="preserve">Катер сначала идёт прямолинейно в противоположном направлении.</w:t>
-      </w:r>
-      <w:r>
-        <w:t xml:space="preserve"> </w:t>
-      </w:r>
-      <w:r>
-        <w:t xml:space="preserve">Расстояние</w:t>
-      </w:r>
-      <w:r>
-        <w:t xml:space="preserve"> </w:t>
-      </w:r>
-      <m:oMath>
-        <m:sSub>
-          <m:e>
-            <m:r>
-              <m:t>x</m:t>
-            </m:r>
-          </m:e>
-          <m:sub>
-            <m:r>
-              <m:t>2</m:t>
-            </m:r>
-          </m:sub>
-        </m:sSub>
         <m:r>
           <m:rPr>
             <m:sty m:val="p"/>
@@ -1206,30 +1175,40 @@
           <m:t>=</m:t>
         </m:r>
         <m:r>
-          <m:t>k</m:t>
-        </m:r>
-        <m:r>
-          <m:rPr>
-            <m:sty m:val="p"/>
-          </m:rPr>
-          <m:t>=</m:t>
-        </m:r>
-        <m:r>
-          <m:t>6</m:t>
+          <m:t>19</m:t>
         </m:r>
       </m:oMath>
       <w:r>
-        <w:t xml:space="preserve">.</w:t>
-      </w:r>
-    </w:p>
-    <w:bookmarkEnd w:id="31"/>
-    <w:bookmarkStart w:id="32" w:name="численное-решение"/>
+        <w:t xml:space="preserve"> </w:t>
+      </w:r>
+      <w:r>
+        <w:t xml:space="preserve">— катер идёт в противоположном</w:t>
+      </w:r>
+      <w:r>
+        <w:t xml:space="preserve"> </w:t>
+      </w:r>
+      <w:r>
+        <w:t xml:space="preserve">направлении.</w:t>
+      </w:r>
+    </w:p>
+    <w:bookmarkEnd w:id="29"/>
+    <w:bookmarkEnd w:id="30"/>
+    <w:bookmarkStart w:id="38" w:name="выполнение-лабораторной-работы"/>
+    <w:p>
+      <w:pPr>
+        <w:pStyle w:val="Heading1"/>
+      </w:pPr>
+      <w:r>
+        <w:t xml:space="preserve">4. Выполнение лабораторной работы</w:t>
+      </w:r>
+    </w:p>
+    <w:bookmarkStart w:id="31" w:name="численное-решение"/>
     <w:p>
       <w:pPr>
         <w:pStyle w:val="Heading2"/>
       </w:pPr>
       <w:r>
-        <w:t xml:space="preserve">4.4 Численное решение</w:t>
+        <w:t xml:space="preserve">4.1 Численное решение</w:t>
       </w:r>
     </w:p>
     <w:p>
@@ -1376,53 +1355,14 @@
         <w:t xml:space="preserve">.</w:t>
       </w:r>
     </w:p>
-    <w:bookmarkEnd w:id="32"/>
-    <w:bookmarkEnd w:id="33"/>
-    <w:bookmarkStart w:id="40" w:name="результаты"/>
-    <w:p>
-      <w:pPr>
-        <w:pStyle w:val="Heading1"/>
-      </w:pPr>
-      <w:r>
-        <w:t xml:space="preserve">5. Результаты</w:t>
-      </w:r>
-    </w:p>
-    <w:bookmarkStart w:id="38" w:name="траектории-движения"/>
+    <w:bookmarkEnd w:id="31"/>
+    <w:bookmarkStart w:id="36" w:name="траектории-движения"/>
     <w:p>
       <w:pPr>
         <w:pStyle w:val="Heading2"/>
       </w:pPr>
       <w:r>
-        <w:t xml:space="preserve">5.1 Траектории движения</w:t>
-      </w:r>
-    </w:p>
-    <w:p>
-      <w:pPr>
-        <w:pStyle w:val="FirstParagraph"/>
-      </w:pPr>
-      <w:r>
-        <w:t xml:space="preserve">На рисунке</w:t>
-      </w:r>
-      <w:r>
-        <w:t xml:space="preserve"> </w:t>
-      </w:r>
-      <w:r>
-        <w:rPr>
-          <w:rStyle w:val="VerbatimChar"/>
-        </w:rPr>
-        <w:t xml:space="preserve">-@fig-pursuit</w:t>
-      </w:r>
-      <w:r>
-        <w:t xml:space="preserve"> </w:t>
-      </w:r>
-      <w:r>
-        <w:t xml:space="preserve">приведены траектории катера (для двух случаев</w:t>
-      </w:r>
-      <w:r>
-        <w:t xml:space="preserve"> </w:t>
-      </w:r>
-      <w:r>
-        <w:t xml:space="preserve">начальных условий) и лодки.</w:t>
+        <w:t xml:space="preserve">4.2 Траектории движения</w:t>
       </w:r>
     </w:p>
     <w:tbl>
@@ -1438,7 +1378,7 @@
       <w:tr>
         <w:tc>
           <w:tcPr/>
-          <w:bookmarkStart w:id="37" w:name="fig-pursuit"/>
+          <w:bookmarkStart w:id="35" w:name="fig-pursuit"/>
           <w:p>
             <w:pPr>
               <w:pStyle w:val="Compact"/>
@@ -1449,18 +1389,18 @@
                 <wp:inline>
                   <wp:extent cx="4800600" cy="3200400"/>
                   <wp:effectExtent b="0" l="0" r="0" t="0"/>
-                  <wp:docPr descr="" title="" id="35" name="Picture"/>
+                  <wp:docPr descr="" title="" id="33" name="Picture"/>
                   <a:graphic>
                     <a:graphicData uri="http://schemas.openxmlformats.org/drawingml/2006/picture">
                       <pic:pic>
                         <pic:nvPicPr>
-                          <pic:cNvPr descr="image/pursuit_trajectory.png" id="36" name="Picture"/>
+                          <pic:cNvPr descr="image/pursuit_trajectory.png" id="34" name="Picture"/>
                           <pic:cNvPicPr>
                             <a:picLocks noChangeArrowheads="1" noChangeAspect="1"/>
                           </pic:cNvPicPr>
                         </pic:nvPicPr>
                         <pic:blipFill>
-                          <a:blip r:embed="rId34"/>
+                          <a:blip r:embed="rId32"/>
                           <a:stretch>
                             <a:fillRect/>
                           </a:stretch>
@@ -1500,18 +1440,107 @@
               <w:t xml:space="preserve">Рисунок 1: Траектория преследования</w:t>
             </w:r>
           </w:p>
-          <w:bookmarkEnd w:id="37"/>
+          <w:bookmarkEnd w:id="35"/>
         </w:tc>
       </w:tr>
     </w:tbl>
+    <w:p>
+      <w:pPr>
+        <w:pStyle w:val="BodyText"/>
+      </w:pPr>
+      <w:r>
+        <w:t xml:space="preserve">На рисунке</w:t>
+      </w:r>
+      <w:r>
+        <w:t xml:space="preserve"> </w:t>
+      </w:r>
+      <w:r>
+        <w:rPr>
+          <w:rStyle w:val="VerbatimChar"/>
+        </w:rPr>
+        <w:t xml:space="preserve">-@fig-pursuit</w:t>
+      </w:r>
+      <w:r>
+        <w:t xml:space="preserve"> </w:t>
+      </w:r>
+      <w:r>
+        <w:t xml:space="preserve">видно, что обе траектории катера (для двух</w:t>
+      </w:r>
+      <w:r>
+        <w:t xml:space="preserve"> </w:t>
+      </w:r>
+      <w:r>
+        <w:t xml:space="preserve">случаев начальных условий) пересекаются с траекторией лодки — точка</w:t>
+      </w:r>
+      <w:r>
+        <w:t xml:space="preserve"> </w:t>
+      </w:r>
+      <w:r>
+        <w:t xml:space="preserve">поимки найдена.</w:t>
+      </w:r>
+    </w:p>
+    <w:bookmarkEnd w:id="36"/>
+    <w:bookmarkStart w:id="37" w:name="точка-пересечения"/>
+    <w:p>
+      <w:pPr>
+        <w:pStyle w:val="Heading2"/>
+      </w:pPr>
+      <w:r>
+        <w:t xml:space="preserve">4.3 Точка пересечения</w:t>
+      </w:r>
+    </w:p>
+    <w:p>
+      <w:pPr>
+        <w:pStyle w:val="FirstParagraph"/>
+      </w:pPr>
+      <w:r>
+        <w:t xml:space="preserve">Точка пересечения траектории катера с траекторией лодки определяет</w:t>
+      </w:r>
+      <w:r>
+        <w:t xml:space="preserve"> </w:t>
+      </w:r>
+      <w:r>
+        <w:t xml:space="preserve">место поимки. При</w:t>
+      </w:r>
+      <w:r>
+        <w:t xml:space="preserve"> </w:t>
+      </w:r>
+      <m:oMath>
+        <m:r>
+          <m:t>n</m:t>
+        </m:r>
+        <m:r>
+          <m:rPr>
+            <m:sty m:val="p"/>
+          </m:rPr>
+          <m:t>=</m:t>
+        </m:r>
+        <m:r>
+          <m:t>5.1</m:t>
+        </m:r>
+      </m:oMath>
+      <w:r>
+        <w:t xml:space="preserve"> </w:t>
+      </w:r>
+      <w:r>
+        <w:t xml:space="preserve">катер значительно быстрее, поэтому</w:t>
+      </w:r>
+      <w:r>
+        <w:t xml:space="preserve"> </w:t>
+      </w:r>
+      <w:r>
+        <w:t xml:space="preserve">догоняет лодку за меньшее время.</w:t>
+      </w:r>
+    </w:p>
+    <w:bookmarkEnd w:id="37"/>
     <w:bookmarkEnd w:id="38"/>
-    <w:bookmarkStart w:id="39" w:name="анализ"/>
-    <w:p>
-      <w:pPr>
-        <w:pStyle w:val="Heading2"/>
-      </w:pPr>
-      <w:r>
-        <w:t xml:space="preserve">5.2 Анализ</w:t>
+    <w:bookmarkStart w:id="39" w:name="результаты"/>
+    <w:p>
+      <w:pPr>
+        <w:pStyle w:val="Heading1"/>
+      </w:pPr>
+      <w:r>
+        <w:t xml:space="preserve">5. Результаты</w:t>
       </w:r>
     </w:p>
     <w:p>
@@ -1523,7 +1552,74 @@
         </w:numPr>
       </w:pPr>
       <w:r>
-        <w:t xml:space="preserve">Катер успешно догоняет лодку в обоих случаях.</w:t>
+        <w:t xml:space="preserve">Для</w:t>
+      </w:r>
+      <w:r>
+        <w:t xml:space="preserve"> </w:t>
+      </w:r>
+      <m:oMath>
+        <m:sSub>
+          <m:e>
+            <m:r>
+              <m:t>θ</m:t>
+            </m:r>
+          </m:e>
+          <m:sub>
+            <m:r>
+              <m:t>0</m:t>
+            </m:r>
+          </m:sub>
+        </m:sSub>
+        <m:r>
+          <m:rPr>
+            <m:sty m:val="p"/>
+          </m:rPr>
+          <m:t>=</m:t>
+        </m:r>
+        <m:r>
+          <m:t>0</m:t>
+        </m:r>
+      </m:oMath>
+      <w:r>
+        <w:t xml:space="preserve">,</w:t>
+      </w:r>
+      <w:r>
+        <w:t xml:space="preserve"> </w:t>
+      </w:r>
+      <m:oMath>
+        <m:sSub>
+          <m:e>
+            <m:r>
+              <m:t>r</m:t>
+            </m:r>
+          </m:e>
+          <m:sub>
+            <m:r>
+              <m:t>0</m:t>
+            </m:r>
+          </m:sub>
+        </m:sSub>
+        <m:r>
+          <m:rPr>
+            <m:sty m:val="p"/>
+          </m:rPr>
+          <m:t>=</m:t>
+        </m:r>
+        <m:r>
+          <m:t>k</m:t>
+        </m:r>
+        <m:r>
+          <m:rPr>
+            <m:sty m:val="p"/>
+          </m:rPr>
+          <m:t>/</m:t>
+        </m:r>
+        <m:r>
+          <m:t>3</m:t>
+        </m:r>
+      </m:oMath>
+      <w:r>
+        <w:t xml:space="preserve">: точка поимки достигается быстро.</w:t>
       </w:r>
     </w:p>
     <w:p>
@@ -1535,7 +1631,71 @@
         </w:numPr>
       </w:pPr>
       <w:r>
-        <w:t xml:space="preserve">Точка пересечения траекторий — точка поимки.</w:t>
+        <w:t xml:space="preserve">Для</w:t>
+      </w:r>
+      <w:r>
+        <w:t xml:space="preserve"> </w:t>
+      </w:r>
+      <m:oMath>
+        <m:sSub>
+          <m:e>
+            <m:r>
+              <m:t>θ</m:t>
+            </m:r>
+          </m:e>
+          <m:sub>
+            <m:r>
+              <m:t>0</m:t>
+            </m:r>
+          </m:sub>
+        </m:sSub>
+        <m:r>
+          <m:rPr>
+            <m:sty m:val="p"/>
+          </m:rPr>
+          <m:t>=</m:t>
+        </m:r>
+        <m:r>
+          <m:rPr>
+            <m:sty m:val="p"/>
+          </m:rPr>
+          <m:t>−</m:t>
+        </m:r>
+        <m:r>
+          <m:t>π</m:t>
+        </m:r>
+      </m:oMath>
+      <w:r>
+        <w:t xml:space="preserve">,</w:t>
+      </w:r>
+      <w:r>
+        <w:t xml:space="preserve"> </w:t>
+      </w:r>
+      <m:oMath>
+        <m:sSub>
+          <m:e>
+            <m:r>
+              <m:t>r</m:t>
+            </m:r>
+          </m:e>
+          <m:sub>
+            <m:r>
+              <m:t>0</m:t>
+            </m:r>
+          </m:sub>
+        </m:sSub>
+        <m:r>
+          <m:rPr>
+            <m:sty m:val="p"/>
+          </m:rPr>
+          <m:t>=</m:t>
+        </m:r>
+        <m:r>
+          <m:t>k</m:t>
+        </m:r>
+      </m:oMath>
+      <w:r>
+        <w:t xml:space="preserve">: катер описывает более широкую спираль.</w:t>
       </w:r>
     </w:p>
     <w:p>
@@ -1547,12 +1707,11 @@
         </w:numPr>
       </w:pPr>
       <w:r>
-        <w:t xml:space="preserve">Траектория катера в первом случае короче.</w:t>
+        <w:t xml:space="preserve">В обоих случаях катер догоняет лодку.</w:t>
       </w:r>
     </w:p>
     <w:bookmarkEnd w:id="39"/>
-    <w:bookmarkEnd w:id="40"/>
-    <w:bookmarkStart w:id="41" w:name="обсуждение-результатов"/>
+    <w:bookmarkStart w:id="40" w:name="обсуждение-результатов"/>
     <w:p>
       <w:pPr>
         <w:pStyle w:val="Heading1"/>
@@ -1692,8 +1851,8 @@
         <w:t xml:space="preserve">Численное решение устойчиво, погрешность минимальна.</w:t>
       </w:r>
     </w:p>
-    <w:bookmarkEnd w:id="41"/>
-    <w:bookmarkStart w:id="42" w:name="заключение"/>
+    <w:bookmarkEnd w:id="40"/>
+    <w:bookmarkStart w:id="41" w:name="заключение"/>
     <w:p>
       <w:pPr>
         <w:pStyle w:val="Heading1"/>
@@ -1738,19 +1897,19 @@
         <w:t xml:space="preserve">Определена точка пересечения траекторий.</w:t>
       </w:r>
     </w:p>
+    <w:bookmarkEnd w:id="41"/>
+    <w:bookmarkStart w:id="43" w:name="список-литературы"/>
+    <w:p>
+      <w:pPr>
+        <w:pStyle w:val="Heading1"/>
+      </w:pPr>
+      <w:r>
+        <w:t xml:space="preserve">Список литературы</w:t>
+      </w:r>
+    </w:p>
+    <w:bookmarkStart w:id="42" w:name="refs"/>
     <w:bookmarkEnd w:id="42"/>
-    <w:bookmarkStart w:id="44" w:name="список-литературы"/>
-    <w:p>
-      <w:pPr>
-        <w:pStyle w:val="Heading1"/>
-      </w:pPr>
-      <w:r>
-        <w:t xml:space="preserve">Список литературы</w:t>
-      </w:r>
-    </w:p>
-    <w:bookmarkStart w:id="43" w:name="refs"/>
     <w:bookmarkEnd w:id="43"/>
-    <w:bookmarkEnd w:id="44"/>
     <w:sectPr>
       <w:footnotePr>
         <w:numRestart w:val="eachSect"/>

</xml_diff>